<commit_message>
Draw every protein annotation across the sequence, so a feature past the first screen stays visible.
Co-authored-by: Cursor <cursoragent@cursor.com>
</commit_message>
<xml_diff>
--- a/docs/Protein-user.docx
+++ b/docs/Protein-user.docx
@@ -348,7 +348,7 @@
         </w:numPr>
       </w:pPr>
       <w:r>
-        <w:t xml:space="preserve">Linear keeps the sequence on one scrolling row. Wrap fits each row to the width of the viewer and numbers the first residue of each row.</w:t>
+        <w:t xml:space="preserve">A map above the residues draws every annotation across the whole sequence, fitted to the panel. Linear keeps the residues on one scrolling row, so click a bar in the map to bring that part of the sequence into view. Wrap fits each row to the width of the viewer and numbers the first residue of each row.</w:t>
       </w:r>
     </w:p>
     <w:p>
@@ -377,7 +377,7 @@
     </w:p>
     <w:p>
       <w:r>
-        <w:t xml:space="preserve">A UniProt import includes the chain plus the features on that entry, such as a signal, peptides, a propeptide, disulfide bonds, helices, strands, turns, and natural variants. A search you saved before features were imported shows the chain bar until you search that entry again.</w:t>
+        <w:t xml:space="preserve">A UniProt import includes the chain plus every feature on that entry: signal, transit and propeptide, chain and peptide, domains and repeats, sites, disulfide bonds and other links, modifications, variants and conflicts, mutagenesis, secondary structure, sequence uncertainty, and non-adjacent residues. A natural variant is named by its substitution, such as R to C, with the UniProt description kept as the note. A search you saved before features were imported shows the chain bar until you search that entry again.</w:t>
       </w:r>
     </w:p>
     <w:p>

</xml_diff>